<commit_message>
Update 3 Disst Docs
</commit_message>
<xml_diff>
--- a/disst/dt_docs/05_CH3_METHODOLOGY.docx
+++ b/disst/dt_docs/05_CH3_METHODOLOGY.docx
@@ -4019,7 +4019,7 @@
           <w:i w:val="0"/>
           <w:sz w:val="24"/>
         </w:rPr>
-        <w:t xml:space="preserve"> The third edge type is dynamic. A 60-day rolling Pearson correlation is computed between the daily returns of every pair of stocks. If the correlation between two stocks exceeds a threshold of 0.6, an undirected edge is created between them for that time step. If the correlation later drops below 0.6, the edge is removed. This captures temporary co-movement clusters, such as the IT sector rallying together when the rupee weakens, or metals stocks moving together when global commodity prices shift. The graph has 147 correlation edges in the snapshot taken from the dashboard at the time of evaluation.</w:t>
+        <w:t xml:space="preserve"> The third edge type is dynamic. A 60-day rolling Pearson correlation is computed between the daily returns of every pair of stocks. If the correlation between two stocks exceeds a threshold of 0.6, an undirected edge is created between them for that time step. If the correlation later drops below 0.6, the edge is removed. This captures temporary co-movement clusters, such as the IT sector rallying together when the rupee weakens, or metals stocks moving together when global commodity prices shift. The number of correlation edges therefore changes day to day. Across the 2024 to 2025 test window the count varied roughly between 90 and 220 edges depending on the market regime, with an average close to 150. The figure of 147 edges quoted later (Table 3.4 and Chapter 4.6) refers to the snapshot taken from the dashboard at the time of evaluation.</w:t>
       </w:r>
     </w:p>
     <w:p>
@@ -6671,6 +6671,20 @@
           <w:i w:val="0"/>
           <w:sz w:val="24"/>
         </w:rPr>
+        <w:t>A GAN-based return generator is used to calibrate the simulation parameters. The generator is a three-layer LSTM with hidden size 128 and latent dimension 64, trained for 500 epochs on the daily returns of the 44 stocks across the 2015 to 2021 training window. During training, the discriminator learns to distinguish real return sequences from generated ones, and the generator learns to produce sequences whose statistical fingerprint matches the historical data. The advantage over a plain Gaussian model is that the GAN preserves heavy tails, volatility clustering, and short-term momentum that Indian equity returns actually exhibit. The forward simulation in Section 4.10 (Black Bootstrap) uses the same calibrated generator to draw block-resampled paths over a one-year horizon.</w:t>
+      </w:r>
+    </w:p>
+    <w:p>
+      <w:pPr>
+        <w:spacing w:before="0" w:after="120" w:line="360" w:lineRule="auto"/>
+      </w:pPr>
+      <w:r>
+        <w:rPr>
+          <w:rFonts w:ascii="Times New Roman" w:hAnsi="Times New Roman"/>
+          <w:b w:val="0"/>
+          <w:i w:val="0"/>
+          <w:sz w:val="24"/>
+        </w:rPr>
         <w:t>The eight scenarios, each calibrated to a historical crisis period, are: Normal (baseline), 2008 Financial Crisis, COVID-19 Crash, Flash Crash, Dot-Com 2000, India Bear 2015, Rate Hike 2022, and Geo-Political Shock. Each applies volatility parameters from the corresponding historical period rather than long-run averages.</w:t>
       </w:r>
     </w:p>
@@ -6800,7 +6814,25 @@
           <w:i w:val="0"/>
           <w:sz w:val="24"/>
         </w:rPr>
-        <w:t xml:space="preserve"> Four sector clients participate in the federated training.</w:t>
+        <w:t xml:space="preserve"> Four sector clients participate in the federated training. The four clients between them cover all 44 stocks (10 + 6 + 8 + 20 = 44). The percentages quoted below describe each client's share of the </w:t>
+      </w:r>
+      <w:r>
+        <w:rPr>
+          <w:rFonts w:ascii="Times New Roman" w:hAnsi="Times New Roman"/>
+          <w:b w:val="0"/>
+          <w:i/>
+          <w:sz w:val="24"/>
+        </w:rPr>
+        <w:t>total portfolio weight</w:t>
+      </w:r>
+      <w:r>
+        <w:rPr>
+          <w:rFonts w:ascii="Times New Roman" w:hAnsi="Times New Roman"/>
+          <w:b w:val="0"/>
+          <w:i w:val="0"/>
+          <w:sz w:val="24"/>
+        </w:rPr>
+        <w:t xml:space="preserve"> under the Ensemble allocation, not the share of the stock count. The two figures differ because the Ensemble allocates capital unevenly across sectors.</w:t>
       </w:r>
     </w:p>
     <w:p>
@@ -6814,7 +6846,7 @@
           <w:i w:val="0"/>
           <w:sz w:val="24"/>
         </w:rPr>
-        <w:t>Client 1 (Banking and Finance) holds ten stocks: HDFCBANK, ICICIBANK, KOTAKBANK, SBIN, AXISBANK, INDUSINDBK, BAJFINANCE, BAJAJFINSV, and others in the finance category. This client represents 23% of the portfolio by weight.</w:t>
+        <w:t>Client 1 (Banking and Finance) holds ten stocks: HDFCBANK, ICICIBANK, KOTAKBANK, SBIN, AXISBANK, INDUSINDBK, BAJFINANCE, BAJAJFINSV, and others in the finance category. This client carries roughly 23% of the portfolio by weight.</w:t>
       </w:r>
     </w:p>
     <w:p>
@@ -6828,7 +6860,7 @@
           <w:i w:val="0"/>
           <w:sz w:val="24"/>
         </w:rPr>
-        <w:t>Client 2 (IT and Telecom) holds six stocks: TCS, INFOSYS, WIPRO, HCLTECH, TECHM, and BHARTIARTL. This client represents 14% of the portfolio.</w:t>
+        <w:t>Client 2 (IT and Telecom) holds six stocks: TCS, INFOSYS, WIPRO, HCLTECH, TECHM, and BHARTIARTL. This client carries roughly 14% of the portfolio by weight.</w:t>
       </w:r>
     </w:p>
     <w:p>
@@ -6842,7 +6874,7 @@
           <w:i w:val="0"/>
           <w:sz w:val="24"/>
         </w:rPr>
-        <w:t>Client 3 (Pharma and FMCG) holds eight stocks: SUNPHARMA, DRREDDY, DIVISLAB, CIPLA, HINDUNILVR, ITC, NESTLEIND, and BRITANNIA. This client represents 18% of the portfolio.</w:t>
+        <w:t>Client 3 (Pharma and FMCG) holds eight stocks: SUNPHARMA, DRREDDY, DIVISLAB, CIPLA, HINDUNILVR, ITC, NESTLEIND, and BRITANNIA. This client carries roughly 18% of the portfolio by weight.</w:t>
       </w:r>
     </w:p>
     <w:p>
@@ -6856,7 +6888,7 @@
           <w:i w:val="0"/>
           <w:sz w:val="24"/>
         </w:rPr>
-        <w:t>Client 4 (Energy, Auto, and Others) holds twenty stocks covering the energy, automotive, metals, infrastructure, and conglomerate categories. This client represents 45% of the portfolio by stock count.</w:t>
+        <w:t>Client 4 (Energy, Auto, and Others) holds twenty stocks covering the energy, automotive, metals, infrastructure, and conglomerate categories. This client carries roughly 45% of the portfolio by weight.</w:t>
       </w:r>
     </w:p>
     <w:p>

</xml_diff>